<commit_message>
BMC HSR: revise figure legends, OMML equation, table titles and STROBE headings
Co-Authored-By: Tatsuki Onishi <bougtoir@gmail.com>
</commit_message>
<xml_diff>
--- a/documents/BMC_HSR/STROBE_checklist_BMC_HSR_EN.docx
+++ b/documents/BMC_HSR/STROBE_checklist_BMC_HSR_EN.docx
@@ -597,7 +597,7 @@
               <w:rPr>
                 <w:sz w:val="18"/>
               </w:rPr>
-              <w:t>Materials and methods, '2.1 Study design and ethical considerations'</w:t>
+              <w:t>Methods, 'Study design and ethical considerations'</w:t>
             </w:r>
           </w:p>
         </w:tc>
@@ -669,7 +669,7 @@
               <w:rPr>
                 <w:sz w:val="18"/>
               </w:rPr>
-              <w:t>Materials and methods, '2.2 Geographic units' and '2.3 Data sources' (fiscal year 2022, 335 secondary medical areas covering all 47 prefectures of Japan)</w:t>
+              <w:t>Methods, 'Geographic units' and 'Data sources and standardised claim ratios' (fiscal year 2022, 335 secondary medical areas covering all 47 prefectures of Japan)</w:t>
             </w:r>
           </w:p>
         </w:tc>
@@ -741,7 +741,7 @@
               <w:rPr>
                 <w:sz w:val="18"/>
               </w:rPr>
-              <w:t>Materials and methods, '2.3 Data sources'; aggregate ecological unit = secondary medical area; no individual-level eligibility criteria</w:t>
+              <w:t>Methods, 'Data sources and standardised claim ratios'; aggregate ecological unit = secondary medical area; no individual-level eligibility criteria</w:t>
             </w:r>
           </w:p>
         </w:tc>
@@ -813,7 +813,7 @@
               <w:rPr>
                 <w:sz w:val="18"/>
               </w:rPr>
-              <w:t>Materials and methods, '2.4 Anaesthesia procedure codes and university hospital mapping' and '2.5 Statistical analysis'</w:t>
+              <w:t>Methods, 'Anaesthesia procedure codes and university hospital mapping' and 'Statistical analysis'</w:t>
             </w:r>
           </w:p>
         </w:tc>
@@ -885,7 +885,7 @@
               <w:rPr>
                 <w:sz w:val="18"/>
               </w:rPr>
-              <w:t>Materials and methods, '2.3 Data sources and standardised claim ratios' (Cabinet Office Regional Variation Visualisation; Survey of Physicians, Dentists and Pharmacists; National Land Numerical Information)</w:t>
+              <w:t>Methods, 'Data sources and standardised claim ratios' (Cabinet Office Regional Variation Visualisation; Survey of Physicians, Dentists and Pharmacists; National Land Numerical Information)</w:t>
             </w:r>
           </w:p>
         </w:tc>
@@ -957,7 +957,7 @@
               <w:rPr>
                 <w:sz w:val="18"/>
               </w:rPr>
-              <w:t>Materials and methods, '2.5 Statistical analysis' and Discussion, '4.2 Strengths and limitations'</w:t>
+              <w:t>Methods, 'Statistical analysis' and Discussion, 'Strengths and limitations'</w:t>
             </w:r>
           </w:p>
         </w:tc>
@@ -1029,7 +1029,7 @@
               <w:rPr>
                 <w:sz w:val="18"/>
               </w:rPr>
-              <w:t>Materials and methods, '2.3 Data sources' (all 335 areas — no sampling)</w:t>
+              <w:t>Methods, 'Data sources and standardised claim ratios' (all 335 areas — no sampling)</w:t>
             </w:r>
           </w:p>
         </w:tc>
@@ -1101,7 +1101,7 @@
               <w:rPr>
                 <w:sz w:val="18"/>
               </w:rPr>
-              <w:t>Materials and methods, '2.5 Statistical analysis' (standardised claim ratio as primary outcome; empirical Bayes shrinkage)</w:t>
+              <w:t>Methods, 'Statistical analysis' (standardised claim ratio as primary outcome; empirical Bayes shrinkage)</w:t>
             </w:r>
           </w:p>
         </w:tc>
@@ -1173,7 +1173,7 @@
               <w:rPr>
                 <w:sz w:val="18"/>
               </w:rPr>
-              <w:t>Materials and methods, '2.5 Statistical analysis' (descriptive statistics, multilevel models with prefecture random intercept, variance decomposition, empirical Bayes shrinkage)</w:t>
+              <w:t>Methods, 'Statistical analysis' (descriptive statistics, multilevel models with prefecture random intercept, variance decomposition, empirical Bayes shrinkage)</w:t>
             </w:r>
           </w:p>
         </w:tc>
@@ -1244,7 +1244,7 @@
               <w:rPr>
                 <w:sz w:val="18"/>
               </w:rPr>
-              <w:t>Results, '3.3 Sensitivity analyses against the audit hypothesis' and '3.4 Robustness: empirical Bayes shrinkage and outliers' (within-prefecture paired comparisons; alternative combined outcomes)</w:t>
+              <w:t>Results, 'Checks against the audit hypothesis' and 'Robustness: empirical Bayes shrinkage and outliers' (within-prefecture paired comparisons; alternative combined outcomes)</w:t>
             </w:r>
           </w:p>
         </w:tc>
@@ -1315,7 +1315,7 @@
               <w:rPr>
                 <w:sz w:val="18"/>
               </w:rPr>
-              <w:t>Materials and methods, '2.5 Statistical analysis' (low-volume areas masked by the data provider are reported as n and excluded from rate calculations)</w:t>
+              <w:t>Methods, 'Statistical analysis' (low-volume areas masked by the data provider are reported as n and excluded from rate calculations)</w:t>
             </w:r>
           </w:p>
         </w:tc>
@@ -1457,7 +1457,7 @@
               <w:rPr>
                 <w:sz w:val="18"/>
               </w:rPr>
-              <w:t>Results, '3.3 Sensitivity analyses against the audit hypothesis'</w:t>
+              <w:t>Results, 'Checks against the audit hypothesis'</w:t>
             </w:r>
           </w:p>
         </w:tc>
@@ -1599,7 +1599,7 @@
               <w:rPr>
                 <w:sz w:val="18"/>
               </w:rPr>
-              <w:t>Results, '3.1 Study population' (335 areas, 47 prefectures, 64 university-hospital areas)</w:t>
+              <w:t>Results, 'Study population and variation in anaesthesia practice' (335 areas, 47 prefectures, 64 university-hospital areas)</w:t>
             </w:r>
           </w:p>
         </w:tc>
@@ -1613,7 +1613,7 @@
               <w:rPr>
                 <w:sz w:val="18"/>
               </w:rPr>
-              <w:t>7–13</w:t>
+              <w:t>7–11</w:t>
             </w:r>
           </w:p>
         </w:tc>
@@ -1670,7 +1670,7 @@
               <w:rPr>
                 <w:sz w:val="18"/>
               </w:rPr>
-              <w:t>Results, '3.1 Study population' (areas masked for low volume reported as n by procedure)</w:t>
+              <w:t>Results, 'Study population and variation in anaesthesia practice' (areas masked for low volume reported as n by procedure)</w:t>
             </w:r>
           </w:p>
         </w:tc>
@@ -1684,7 +1684,7 @@
               <w:rPr>
                 <w:sz w:val="18"/>
               </w:rPr>
-              <w:t>7–13</w:t>
+              <w:t>7–11</w:t>
             </w:r>
           </w:p>
         </w:tc>
@@ -1813,7 +1813,7 @@
               <w:rPr>
                 <w:sz w:val="18"/>
               </w:rPr>
-              <w:t>Results, '3.1 Study population and variation in anaesthesia practice'; Table 1 and Table 2</w:t>
+              <w:t>Results, 'Study population and variation in anaesthesia practice'; Table 1 and Table 2</w:t>
             </w:r>
           </w:p>
         </w:tc>
@@ -1827,7 +1827,7 @@
               <w:rPr>
                 <w:sz w:val="18"/>
               </w:rPr>
-              <w:t>8, 10</w:t>
+              <w:t>8, 9</w:t>
             </w:r>
           </w:p>
         </w:tc>
@@ -1956,7 +1956,7 @@
               <w:rPr>
                 <w:sz w:val="18"/>
               </w:rPr>
-              <w:t>Results, '3.1 Study population and variation in anaesthesia practice' and Tables 1–2 (means, SD, IQR, range, coefficients of variation)</w:t>
+              <w:t>Results, 'Study population and variation in anaesthesia practice' and Tables 1–2 (means, SD, IQR, range, coefficients of variation)</w:t>
             </w:r>
           </w:p>
         </w:tc>
@@ -1970,7 +1970,7 @@
               <w:rPr>
                 <w:sz w:val="18"/>
               </w:rPr>
-              <w:t>8–10</w:t>
+              <w:t>8–9</w:t>
             </w:r>
           </w:p>
         </w:tc>
@@ -2028,7 +2028,7 @@
               <w:rPr>
                 <w:sz w:val="18"/>
               </w:rPr>
-              <w:t>Results, '3.2 Multilevel model and university hospital effect'; Table 2 (mixed-effects coefficients with 95% confidence intervals)</w:t>
+              <w:t>Results, 'Multilevel model and university hospital effect'; Table 2 (mixed-effects coefficients with 95% confidence intervals)</w:t>
             </w:r>
           </w:p>
         </w:tc>
@@ -2042,7 +2042,7 @@
               <w:rPr>
                 <w:sz w:val="18"/>
               </w:rPr>
-              <w:t>10</w:t>
+              <w:t>9</w:t>
             </w:r>
           </w:p>
         </w:tc>
@@ -2113,7 +2113,7 @@
               <w:rPr>
                 <w:sz w:val="18"/>
               </w:rPr>
-              <w:t>9, 12</w:t>
+              <w:t>20, 20</w:t>
             </w:r>
           </w:p>
         </w:tc>
@@ -2242,7 +2242,7 @@
               <w:rPr>
                 <w:sz w:val="18"/>
               </w:rPr>
-              <w:t>Results, '3.3 Sensitivity analyses against the audit hypothesis' and '3.4 Robustness: empirical Bayes shrinkage and outliers' (empirical Bayes shrinkage; within-prefecture comparisons; combined codes)</w:t>
+              <w:t>Results, 'Checks against the audit hypothesis' and 'Robustness: empirical Bayes shrinkage and outliers' (empirical Bayes shrinkage; within-prefecture comparisons; combined codes)</w:t>
             </w:r>
           </w:p>
         </w:tc>
@@ -2256,7 +2256,7 @@
               <w:rPr>
                 <w:sz w:val="18"/>
               </w:rPr>
-              <w:t>7–13</w:t>
+              <w:t>7–11</w:t>
             </w:r>
           </w:p>
         </w:tc>
@@ -2384,7 +2384,7 @@
               <w:rPr>
                 <w:sz w:val="18"/>
               </w:rPr>
-              <w:t>Discussion, '4.1 Statement of principal findings'</w:t>
+              <w:t>Discussion, 'Statement of principal findings'</w:t>
             </w:r>
           </w:p>
         </w:tc>
@@ -2398,7 +2398,7 @@
               <w:rPr>
                 <w:sz w:val="18"/>
               </w:rPr>
-              <w:t>14–16</w:t>
+              <w:t>12–15</w:t>
             </w:r>
           </w:p>
         </w:tc>
@@ -2456,7 +2456,7 @@
               <w:rPr>
                 <w:sz w:val="18"/>
               </w:rPr>
-              <w:t>Discussion, '4.2 Strengths and limitations'</w:t>
+              <w:t>Discussion, 'Strengths and limitations'</w:t>
             </w:r>
           </w:p>
         </w:tc>
@@ -2470,7 +2470,7 @@
               <w:rPr>
                 <w:sz w:val="18"/>
               </w:rPr>
-              <w:t>14–16</w:t>
+              <w:t>12–15</w:t>
             </w:r>
           </w:p>
         </w:tc>
@@ -2528,7 +2528,7 @@
               <w:rPr>
                 <w:sz w:val="18"/>
               </w:rPr>
-              <w:t>Discussion, '4.3 International generalizability and clinical relevance'</w:t>
+              <w:t>Discussion, 'International generalizability and clinical relevance'</w:t>
             </w:r>
           </w:p>
         </w:tc>
@@ -2542,7 +2542,7 @@
               <w:rPr>
                 <w:sz w:val="18"/>
               </w:rPr>
-              <w:t>14–16</w:t>
+              <w:t>12–15</w:t>
             </w:r>
           </w:p>
         </w:tc>
@@ -2600,7 +2600,7 @@
               <w:rPr>
                 <w:sz w:val="18"/>
               </w:rPr>
-              <w:t>Discussion, '4.3 International generalizability and clinical relevance' and '4.4 Implications for perioperative practice and policy'</w:t>
+              <w:t>Discussion, 'International generalizability and clinical relevance' and 'Implications for perioperative practice and policy'</w:t>
             </w:r>
           </w:p>
         </w:tc>
@@ -2614,7 +2614,7 @@
               <w:rPr>
                 <w:sz w:val="18"/>
               </w:rPr>
-              <w:t>14–16</w:t>
+              <w:t>12–15</w:t>
             </w:r>
           </w:p>
         </w:tc>

</xml_diff>

<commit_message>
Reviewer-level BMC HSR journal-fit edits: clarify effect-size and multilevel methods citations, table ordering, soften causal wording, update STROBE highlight references, regenerate submission package
Co-Authored-By: Tatsuki Onishi <bougtoir@gmail.com>
</commit_message>
<xml_diff>
--- a/documents/BMC_HSR/STROBE_checklist_BMC_HSR_EN.docx
+++ b/documents/BMC_HSR/STROBE_checklist_BMC_HSR_EN.docx
@@ -1827,7 +1827,7 @@
               <w:rPr>
                 <w:sz w:val="18"/>
               </w:rPr>
-              <w:t>8, 9</w:t>
+              <w:t>8, 10</w:t>
             </w:r>
           </w:p>
         </w:tc>
@@ -1970,7 +1970,7 @@
               <w:rPr>
                 <w:sz w:val="18"/>
               </w:rPr>
-              <w:t>8–9</w:t>
+              <w:t>8–10</w:t>
             </w:r>
           </w:p>
         </w:tc>
@@ -2042,7 +2042,7 @@
               <w:rPr>
                 <w:sz w:val="18"/>
               </w:rPr>
-              <w:t>9</w:t>
+              <w:t>10</w:t>
             </w:r>
           </w:p>
         </w:tc>
@@ -2384,7 +2384,7 @@
               <w:rPr>
                 <w:sz w:val="18"/>
               </w:rPr>
-              <w:t>Discussion, 'Statement of principal findings'</w:t>
+              <w:t>Discussion, 'Summary of principal findings'</w:t>
             </w:r>
           </w:p>
         </w:tc>

</xml_diff>